<commit_message>
Reframe Redsalt EOI around suitability: experience elsewhere applies directly
Co-Authored-By: Claude Sonnet 5.5 <noreply@anthropic.com>
Claude-Session: https://claude.ai/code/session_01WiBnBeNuuswtpuGnzBwLUc
</commit_message>
<xml_diff>
--- a/outputs/EOI_Redsalt_Commercial_Due_Diligence_SIC_DRAFT.docx
+++ b/outputs/EOI_Redsalt_Commercial_Due_Diligence_SIC_DRAFT.docx
@@ -287,7 +287,7 @@
         <w:rPr>
           <w:b w:val="0"/>
         </w:rPr>
-        <w:t>submits this expression of interest to conduct the commercial due diligence of Redsalt’s two Sierra Leone pipeline companies. We are a Freetown-based team that has assessed early-stage businesses from the investor’s side of the table, and we will turn the commercial analysis into a clear, evidence-based investment recommendation for each company.</w:t>
+        <w:t>submits this expression of interest to conduct the commercial due diligence of Redsalt’s two Sierra Leone pipeline companies. We have spent the last several years assessing the kind of company Redsalt backs: early-stage, founder-led businesses in frontier markets, examined for an investment decision. We bring that method to Sierra Leone with a team that is based in Freetown, and we will finish each report with a clear recommendation and the conditions that go with it.</w:t>
       </w:r>
     </w:p>
     <w:p>
@@ -301,7 +301,217 @@
           <w:color w:val="132347"/>
           <w:sz w:val="23"/>
         </w:rPr>
-        <w:t>1.   Firm information</w:t>
+        <w:t>1.   Why we are suited</w:t>
+      </w:r>
+    </w:p>
+    <w:p>
+      <w:pPr>
+        <w:spacing w:after="80"/>
+      </w:pPr>
+      <w:r>
+        <w:rPr>
+          <w:b w:val="0"/>
+          <w:i w:val="0"/>
+        </w:rPr>
+        <w:t>The questions in this assignment are the ones we ask of every company we assess: is the model viable, do the unit economics hold, are management’s assumptions supported by evidence, what is the company ready for, and what could stop an investment. Our experience answering them in other African markets applies directly. What changes in Sierra Leone is the operating context, and that is where our Freetown team adds the local knowledge.</w:t>
+      </w:r>
+    </w:p>
+    <w:tbl>
+      <w:tblPr>
+        <w:tblW w:type="auto" w:w="0"/>
+        <w:tblLayout w:type="fixed"/>
+        <w:tblLook w:firstColumn="1" w:firstRow="1" w:lastColumn="0" w:lastRow="0" w:noHBand="0" w:noVBand="1" w:val="04A0"/>
+        <w:tblCellMar>
+          <w:top w:w="60" w:type="dxa"/>
+          <w:left w:w="90" w:type="dxa"/>
+          <w:bottom w:w="60" w:type="dxa"/>
+          <w:right w:w="90" w:type="dxa"/>
+        </w:tblCellMar>
+      </w:tblPr>
+      <w:tblGrid>
+        <w:gridCol w:w="4507"/>
+        <w:gridCol w:w="4507"/>
+      </w:tblGrid>
+      <w:tr>
+        <w:tc>
+          <w:tcPr>
+            <w:tcW w:type="dxa" w:w="2608"/>
+            <w:shd w:val="clear" w:color="auto" w:fill="FEF4D6"/>
+          </w:tcPr>
+          <w:p>
+            <w:pPr>
+              <w:spacing w:after="0"/>
+            </w:pPr>
+            <w:r>
+              <w:rPr>
+                <w:b/>
+                <w:color w:val="132347"/>
+              </w:rPr>
+              <w:t>What Redsalt asks for</w:t>
+            </w:r>
+          </w:p>
+        </w:tc>
+        <w:tc>
+          <w:tcPr>
+            <w:tcW w:type="dxa" w:w="6406"/>
+            <w:shd w:val="clear" w:color="auto" w:fill="FEF4D6"/>
+          </w:tcPr>
+          <w:p>
+            <w:pPr>
+              <w:spacing w:after="0"/>
+            </w:pPr>
+            <w:r>
+              <w:rPr>
+                <w:b/>
+                <w:color w:val="132347"/>
+              </w:rPr>
+              <w:t>What we bring</w:t>
+            </w:r>
+          </w:p>
+        </w:tc>
+      </w:tr>
+      <w:tr>
+        <w:tc>
+          <w:tcPr>
+            <w:tcW w:type="dxa" w:w="2608"/>
+          </w:tcPr>
+          <w:p>
+            <w:pPr>
+              <w:spacing w:after="0"/>
+            </w:pPr>
+            <w:r>
+              <w:rPr>
+                <w:b/>
+              </w:rPr>
+              <w:t>Commercial due diligence expertise</w:t>
+            </w:r>
+          </w:p>
+        </w:tc>
+        <w:tc>
+          <w:tcPr>
+            <w:tcW w:type="dxa" w:w="6406"/>
+          </w:tcPr>
+          <w:p>
+            <w:pPr>
+              <w:spacing w:after="0"/>
+            </w:pPr>
+            <w:r>
+              <w:t>Assessment of business models, markets, customers, operations and unit economics for 64+ early-stage companies from 14 African countries, written up as 8+ investment memoranda; due diligence on shortlisted teams for an impact-first funder; reviews of 150+ startups for investment committees.</w:t>
+            </w:r>
+          </w:p>
+        </w:tc>
+      </w:tr>
+      <w:tr>
+        <w:tc>
+          <w:tcPr>
+            <w:tcW w:type="dxa" w:w="2608"/>
+          </w:tcPr>
+          <w:p>
+            <w:pPr>
+              <w:spacing w:after="0"/>
+            </w:pPr>
+            <w:r>
+              <w:rPr>
+                <w:b/>
+              </w:rPr>
+              <w:t>Sierra Leone and West African experience</w:t>
+            </w:r>
+          </w:p>
+        </w:tc>
+        <w:tc>
+          <w:tcPr>
+            <w:tcW w:type="dxa" w:w="6406"/>
+          </w:tcPr>
+          <w:p>
+            <w:pPr>
+              <w:spacing w:after="0"/>
+            </w:pPr>
+            <w:r>
+              <w:t>A Freetown-based lead consultant and operations expert. Smart Investment has operated in Sierra Leone since 2001. Regina Clarkson currently advises a Sierra Leone ministry on its innovation and investment fund, and has built and run Sierra Leone businesses herself. Boisy Williams has led operations in West Africa, including three years in Burkina Faso.</w:t>
+            </w:r>
+          </w:p>
+        </w:tc>
+      </w:tr>
+      <w:tr>
+        <w:tc>
+          <w:tcPr>
+            <w:tcW w:type="dxa" w:w="2608"/>
+          </w:tcPr>
+          <w:p>
+            <w:pPr>
+              <w:spacing w:after="0"/>
+            </w:pPr>
+            <w:r>
+              <w:rPr>
+                <w:b/>
+              </w:rPr>
+              <w:t>An investment perspective</w:t>
+            </w:r>
+          </w:p>
+        </w:tc>
+        <w:tc>
+          <w:tcPr>
+            <w:tcW w:type="dxa" w:w="6406"/>
+          </w:tcPr>
+          <w:p>
+            <w:pPr>
+              <w:spacing w:after="0"/>
+            </w:pPr>
+            <w:r>
+              <w:t>Regina has chaired an investment committee and prepared 10+ investment memoranda covering financial modelling, valuation and deal structuring. Our reports end in a recommendation and conditions, not a description of the business.</w:t>
+            </w:r>
+          </w:p>
+        </w:tc>
+      </w:tr>
+      <w:tr>
+        <w:tc>
+          <w:tcPr>
+            <w:tcW w:type="dxa" w:w="2608"/>
+          </w:tcPr>
+          <w:p>
+            <w:pPr>
+              <w:spacing w:after="0"/>
+            </w:pPr>
+            <w:r>
+              <w:rPr>
+                <w:b/>
+              </w:rPr>
+              <w:t>Analytical and reporting strength</w:t>
+            </w:r>
+          </w:p>
+        </w:tc>
+        <w:tc>
+          <w:tcPr>
+            <w:tcW w:type="dxa" w:w="6406"/>
+          </w:tcPr>
+          <w:p>
+            <w:pPr>
+              <w:spacing w:after="0"/>
+            </w:pPr>
+            <w:r>
+              <w:t>Published research on Africa’s impact investment landscape, a five-year impact report, and a method that labels every finding as verified, documented, asserted or unverified.</w:t>
+            </w:r>
+          </w:p>
+        </w:tc>
+      </w:tr>
+    </w:tbl>
+    <w:p>
+      <w:pPr>
+        <w:spacing w:after="40"/>
+      </w:pPr>
+    </w:p>
+    <w:p>
+      <w:pPr>
+        <w:keepNext/>
+        <w:spacing w:before="200" w:after="100"/>
+      </w:pPr>
+      <w:r>
+        <w:rPr>
+          <w:b/>
+          <w:color w:val="132347"/>
+          <w:sz w:val="23"/>
+        </w:rPr>
+        <w:t>2.   Firm information</w:t>
       </w:r>
     </w:p>
     <w:p>
@@ -333,7 +543,7 @@
           <w:color w:val="132347"/>
           <w:sz w:val="23"/>
         </w:rPr>
-        <w:t>2.   Relevant experience</w:t>
+        <w:t>3.   Relevant experience</w:t>
       </w:r>
     </w:p>
     <w:p>
@@ -345,7 +555,7 @@
           <w:b w:val="0"/>
           <w:i w:val="0"/>
         </w:rPr>
-        <w:t>Our due diligence experience is on early-stage and growth businesses, assessed for investors. The assignments below are the comparable work we put forward.</w:t>
+        <w:t>The assignments below are the comparable work we put forward. Each is due diligence on early-stage or growth businesses for an investment decision, and each applies directly to Redsalt’s Sierra Leone pipeline.</w:t>
       </w:r>
     </w:p>
     <w:tbl>
@@ -667,7 +877,7 @@
           <w:color w:val="132347"/>
           <w:sz w:val="23"/>
         </w:rPr>
-        <w:t>3.   Proposed team</w:t>
+        <w:t>4.   Proposed team</w:t>
       </w:r>
     </w:p>
     <w:tbl>
@@ -989,7 +1199,7 @@
           <w:color w:val="132347"/>
           <w:sz w:val="23"/>
         </w:rPr>
-        <w:t>4.   Approach and methodology</w:t>
+        <w:t>5.   Approach and methodology</w:t>
       </w:r>
     </w:p>
     <w:p>
@@ -1388,7 +1598,7 @@
           <w:color w:val="132347"/>
           <w:sz w:val="23"/>
         </w:rPr>
-        <w:t>5.   Availability and independence</w:t>
+        <w:t>6.   Availability and independence</w:t>
       </w:r>
     </w:p>
     <w:p>
@@ -1437,7 +1647,7 @@
           <w:color w:val="132347"/>
           <w:sz w:val="23"/>
         </w:rPr>
-        <w:t>6.   Confidentiality and commercial terms</w:t>
+        <w:t>7.   Confidentiality and commercial terms</w:t>
       </w:r>
     </w:p>
     <w:p>

</xml_diff>

<commit_message>
Redsalt EOI: SIC cover palette (no coral), tighter opening, corrected claims
Co-Authored-By: Claude Sonnet 5.5 <noreply@anthropic.com>
Claude-Session: https://claude.ai/code/session_01WiBnBeNuuswtpuGnzBwLUc
</commit_message>
<xml_diff>
--- a/outputs/EOI_Redsalt_Commercial_Due_Diligence_SIC_DRAFT.docx
+++ b/outputs/EOI_Redsalt_Commercial_Due_Diligence_SIC_DRAFT.docx
@@ -50,7 +50,7 @@
         <w:tc>
           <w:tcPr>
             <w:tcW w:type="dxa" w:w="2381"/>
-            <w:shd w:val="clear" w:color="auto" w:fill="FEF4D6"/>
+            <w:shd w:val="clear" w:color="auto" w:fill="E8EFF5"/>
           </w:tcPr>
           <w:p>
             <w:pPr>
@@ -82,7 +82,7 @@
         <w:tc>
           <w:tcPr>
             <w:tcW w:type="dxa" w:w="2381"/>
-            <w:shd w:val="clear" w:color="auto" w:fill="FEF4D6"/>
+            <w:shd w:val="clear" w:color="auto" w:fill="E8EFF5"/>
           </w:tcPr>
           <w:p>
             <w:pPr>
@@ -114,7 +114,7 @@
         <w:tc>
           <w:tcPr>
             <w:tcW w:type="dxa" w:w="2381"/>
-            <w:shd w:val="clear" w:color="auto" w:fill="FEF4D6"/>
+            <w:shd w:val="clear" w:color="auto" w:fill="E8EFF5"/>
           </w:tcPr>
           <w:p>
             <w:pPr>
@@ -146,7 +146,7 @@
         <w:tc>
           <w:tcPr>
             <w:tcW w:type="dxa" w:w="2381"/>
-            <w:shd w:val="clear" w:color="auto" w:fill="FEF4D6"/>
+            <w:shd w:val="clear" w:color="auto" w:fill="E8EFF5"/>
           </w:tcPr>
           <w:p>
             <w:pPr>
@@ -178,7 +178,7 @@
         <w:tc>
           <w:tcPr>
             <w:tcW w:type="dxa" w:w="2381"/>
-            <w:shd w:val="clear" w:color="auto" w:fill="FEF4D6"/>
+            <w:shd w:val="clear" w:color="auto" w:fill="E8EFF5"/>
           </w:tcPr>
           <w:p>
             <w:pPr>
@@ -210,7 +210,7 @@
         <w:tc>
           <w:tcPr>
             <w:tcW w:type="dxa" w:w="2381"/>
-            <w:shd w:val="clear" w:color="auto" w:fill="FEF4D6"/>
+            <w:shd w:val="clear" w:color="auto" w:fill="E8EFF5"/>
           </w:tcPr>
           <w:p>
             <w:pPr>
@@ -242,7 +242,7 @@
         <w:tc>
           <w:tcPr>
             <w:tcW w:type="dxa" w:w="2381"/>
-            <w:shd w:val="clear" w:color="auto" w:fill="FEF4D6"/>
+            <w:shd w:val="clear" w:color="auto" w:fill="E8EFF5"/>
           </w:tcPr>
           <w:p>
             <w:pPr>
@@ -287,7 +287,7 @@
         <w:rPr>
           <w:b w:val="0"/>
         </w:rPr>
-        <w:t>submits this expression of interest to conduct the commercial due diligence of Redsalt’s two Sierra Leone pipeline companies. We have spent the last several years assessing the kind of company Redsalt backs: early-stage, founder-led businesses in frontier markets, examined for an investment decision. We bring that method to Sierra Leone with a team that is based in Freetown, and we will finish each report with a clear recommendation and the conditions that go with it.</w:t>
+        <w:t>submits this expression of interest to conduct the commercial due diligence of Redsalt’s two Sierra Leone pipeline companies. Redsalt describes itself as an impact-first angel investor providing patient capital and hands-on support to early-stage businesses in low-income frontier markets. Since 2023 we have assessed that kind of company across Africa: early-stage, founder-led businesses examined for an investment decision. We bring the same approach to Sierra Leone, led from Freetown, and we will finish each report with a clear recommendation and the conditions that go with it.</w:t>
       </w:r>
     </w:p>
     <w:p>
@@ -298,7 +298,7 @@
       <w:r>
         <w:rPr>
           <w:b/>
-          <w:color w:val="132347"/>
+          <w:color w:val="0E324D"/>
           <w:sz w:val="23"/>
         </w:rPr>
         <w:t>1.   Why we are suited</w:t>
@@ -336,7 +336,7 @@
         <w:tc>
           <w:tcPr>
             <w:tcW w:type="dxa" w:w="2608"/>
-            <w:shd w:val="clear" w:color="auto" w:fill="FEF4D6"/>
+            <w:shd w:val="clear" w:color="auto" w:fill="E8EFF5"/>
           </w:tcPr>
           <w:p>
             <w:pPr>
@@ -345,7 +345,7 @@
             <w:r>
               <w:rPr>
                 <w:b/>
-                <w:color w:val="132347"/>
+                <w:color w:val="0E324D"/>
               </w:rPr>
               <w:t>What Redsalt asks for</w:t>
             </w:r>
@@ -354,7 +354,7 @@
         <w:tc>
           <w:tcPr>
             <w:tcW w:type="dxa" w:w="6406"/>
-            <w:shd w:val="clear" w:color="auto" w:fill="FEF4D6"/>
+            <w:shd w:val="clear" w:color="auto" w:fill="E8EFF5"/>
           </w:tcPr>
           <w:p>
             <w:pPr>
@@ -363,7 +363,7 @@
             <w:r>
               <w:rPr>
                 <w:b/>
-                <w:color w:val="132347"/>
+                <w:color w:val="0E324D"/>
               </w:rPr>
               <w:t>What we bring</w:t>
             </w:r>
@@ -427,7 +427,7 @@
               <w:spacing w:after="0"/>
             </w:pPr>
             <w:r>
-              <w:t>A Freetown-based lead consultant and operations expert. Smart Investment has operated in Sierra Leone since 2001. Regina Clarkson currently advises a Sierra Leone ministry on its innovation and investment fund, and has built and run Sierra Leone businesses herself. Boisy Williams has led operations in West Africa, including three years in Burkina Faso.</w:t>
+              <w:t>A lead consultant and an operations expert who are both based in Freetown. Smart Investment has operated in Sierra Leone since 2001. Regina Clarkson currently advises a Sierra Leone ministry on its innovation and investment fund, and has built and run Sierra Leone businesses herself. Boisy Williams has led operations in West Africa, including three years in Burkina Faso.</w:t>
             </w:r>
           </w:p>
         </w:tc>
@@ -508,7 +508,7 @@
       <w:r>
         <w:rPr>
           <w:b/>
-          <w:color w:val="132347"/>
+          <w:color w:val="0E324D"/>
           <w:sz w:val="23"/>
         </w:rPr>
         <w:t>2.   Firm information</w:t>
@@ -540,7 +540,7 @@
       <w:r>
         <w:rPr>
           <w:b/>
-          <w:color w:val="132347"/>
+          <w:color w:val="0E324D"/>
           <w:sz w:val="23"/>
         </w:rPr>
         <w:t>3.   Relevant experience</w:t>
@@ -579,7 +579,7 @@
         <w:tc>
           <w:tcPr>
             <w:tcW w:type="dxa" w:w="2381"/>
-            <w:shd w:val="clear" w:color="auto" w:fill="FEF4D6"/>
+            <w:shd w:val="clear" w:color="auto" w:fill="E8EFF5"/>
           </w:tcPr>
           <w:p>
             <w:pPr>
@@ -588,7 +588,7 @@
             <w:r>
               <w:rPr>
                 <w:b/>
-                <w:color w:val="132347"/>
+                <w:color w:val="0E324D"/>
               </w:rPr>
               <w:t>Assignment</w:t>
             </w:r>
@@ -597,7 +597,7 @@
         <w:tc>
           <w:tcPr>
             <w:tcW w:type="dxa" w:w="4195"/>
-            <w:shd w:val="clear" w:color="auto" w:fill="FEF4D6"/>
+            <w:shd w:val="clear" w:color="auto" w:fill="E8EFF5"/>
           </w:tcPr>
           <w:p>
             <w:pPr>
@@ -606,7 +606,7 @@
             <w:r>
               <w:rPr>
                 <w:b/>
-                <w:color w:val="132347"/>
+                <w:color w:val="0E324D"/>
               </w:rPr>
               <w:t>What we did</w:t>
             </w:r>
@@ -615,7 +615,7 @@
         <w:tc>
           <w:tcPr>
             <w:tcW w:type="dxa" w:w="2438"/>
-            <w:shd w:val="clear" w:color="auto" w:fill="FEF4D6"/>
+            <w:shd w:val="clear" w:color="auto" w:fill="E8EFF5"/>
           </w:tcPr>
           <w:p>
             <w:pPr>
@@ -624,7 +624,7 @@
             <w:r>
               <w:rPr>
                 <w:b/>
-                <w:color w:val="132347"/>
+                <w:color w:val="0E324D"/>
               </w:rPr>
               <w:t>Relevance to Redsalt</w:t>
             </w:r>
@@ -874,7 +874,7 @@
       <w:r>
         <w:rPr>
           <w:b/>
-          <w:color w:val="132347"/>
+          <w:color w:val="0E324D"/>
           <w:sz w:val="23"/>
         </w:rPr>
         <w:t>4.   Proposed team</w:t>
@@ -901,7 +901,7 @@
         <w:tc>
           <w:tcPr>
             <w:tcW w:type="dxa" w:w="2041"/>
-            <w:shd w:val="clear" w:color="auto" w:fill="FEF4D6"/>
+            <w:shd w:val="clear" w:color="auto" w:fill="E8EFF5"/>
           </w:tcPr>
           <w:p>
             <w:pPr>
@@ -910,7 +910,7 @@
             <w:r>
               <w:rPr>
                 <w:b/>
-                <w:color w:val="132347"/>
+                <w:color w:val="0E324D"/>
               </w:rPr>
               <w:t>Role</w:t>
             </w:r>
@@ -919,7 +919,7 @@
         <w:tc>
           <w:tcPr>
             <w:tcW w:type="dxa" w:w="2041"/>
-            <w:shd w:val="clear" w:color="auto" w:fill="FEF4D6"/>
+            <w:shd w:val="clear" w:color="auto" w:fill="E8EFF5"/>
           </w:tcPr>
           <w:p>
             <w:pPr>
@@ -928,7 +928,7 @@
             <w:r>
               <w:rPr>
                 <w:b/>
-                <w:color w:val="132347"/>
+                <w:color w:val="0E324D"/>
               </w:rPr>
               <w:t>Name</w:t>
             </w:r>
@@ -937,7 +937,7 @@
         <w:tc>
           <w:tcPr>
             <w:tcW w:type="dxa" w:w="4932"/>
-            <w:shd w:val="clear" w:color="auto" w:fill="FEF4D6"/>
+            <w:shd w:val="clear" w:color="auto" w:fill="E8EFF5"/>
           </w:tcPr>
           <w:p>
             <w:pPr>
@@ -946,7 +946,7 @@
             <w:r>
               <w:rPr>
                 <w:b/>
-                <w:color w:val="132347"/>
+                <w:color w:val="0E324D"/>
               </w:rPr>
               <w:t>Contribution</w:t>
             </w:r>
@@ -1124,7 +1124,7 @@
               <w:spacing w:after="0"/>
             </w:pPr>
             <w:r>
-              <w:t>Commercial and sector expertise matched to the two companies once their sectors are disclosed (the call refers to agriculture and technology components). Name and CV to follow.</w:t>
+              <w:t>Commercial and sector expertise matched to the two companies once their sectors are disclosed. The call includes agriculture-specific and technology-specific criteria, so we expect to cover both. [TBC: name and CV.]</w:t>
             </w:r>
           </w:p>
         </w:tc>
@@ -1196,7 +1196,7 @@
       <w:r>
         <w:rPr>
           <w:b/>
-          <w:color w:val="132347"/>
+          <w:color w:val="0E324D"/>
           <w:sz w:val="23"/>
         </w:rPr>
         <w:t>5.   Approach and methodology</w:t>
@@ -1211,7 +1211,7 @@
           <w:b w:val="0"/>
           <w:i w:val="0"/>
         </w:rPr>
-        <w:t>We will work to the five deliverables in the call and keep to the 26 October to 4 December window.</w:t>
+        <w:t>We will deliver the five expected deliverables set out in section 7 of the call, within the 26 October to 4 December window.</w:t>
       </w:r>
     </w:p>
     <w:tbl>
@@ -1235,7 +1235,7 @@
         <w:tc>
           <w:tcPr>
             <w:tcW w:type="dxa" w:w="1928"/>
-            <w:shd w:val="clear" w:color="auto" w:fill="FEF4D6"/>
+            <w:shd w:val="clear" w:color="auto" w:fill="E8EFF5"/>
           </w:tcPr>
           <w:p>
             <w:pPr>
@@ -1244,7 +1244,7 @@
             <w:r>
               <w:rPr>
                 <w:b/>
-                <w:color w:val="132347"/>
+                <w:color w:val="0E324D"/>
               </w:rPr>
               <w:t>Stage</w:t>
             </w:r>
@@ -1253,7 +1253,7 @@
         <w:tc>
           <w:tcPr>
             <w:tcW w:type="dxa" w:w="1474"/>
-            <w:shd w:val="clear" w:color="auto" w:fill="FEF4D6"/>
+            <w:shd w:val="clear" w:color="auto" w:fill="E8EFF5"/>
           </w:tcPr>
           <w:p>
             <w:pPr>
@@ -1262,7 +1262,7 @@
             <w:r>
               <w:rPr>
                 <w:b/>
-                <w:color w:val="132347"/>
+                <w:color w:val="0E324D"/>
               </w:rPr>
               <w:t>Dates</w:t>
             </w:r>
@@ -1271,7 +1271,7 @@
         <w:tc>
           <w:tcPr>
             <w:tcW w:type="dxa" w:w="5613"/>
-            <w:shd w:val="clear" w:color="auto" w:fill="FEF4D6"/>
+            <w:shd w:val="clear" w:color="auto" w:fill="E8EFF5"/>
           </w:tcPr>
           <w:p>
             <w:pPr>
@@ -1280,7 +1280,7 @@
             <w:r>
               <w:rPr>
                 <w:b/>
-                <w:color w:val="132347"/>
+                <w:color w:val="0E324D"/>
               </w:rPr>
               <w:t>Activity and output</w:t>
             </w:r>
@@ -1595,7 +1595,7 @@
       <w:r>
         <w:rPr>
           <w:b/>
-          <w:color w:val="132347"/>
+          <w:color w:val="0E324D"/>
           <w:sz w:val="23"/>
         </w:rPr>
         <w:t>6.   Availability and independence</w:t>
@@ -1644,7 +1644,7 @@
       <w:r>
         <w:rPr>
           <w:b/>
-          <w:color w:val="132347"/>
+          <w:color w:val="0E324D"/>
           <w:sz w:val="23"/>
         </w:rPr>
         <w:t>7.   Confidentiality and commercial terms</w:t>
@@ -1711,7 +1711,7 @@
           <w:r>
             <w:rPr>
               <w:b/>
-              <w:color w:val="132347"/>
+              <w:color w:val="0E324D"/>
               <w:sz w:val="15"/>
             </w:rPr>
             <w:t>OFFICE Sierra Leone</w:t>
@@ -1723,7 +1723,7 @@
           </w:pPr>
           <w:r>
             <w:rPr>
-              <w:color w:val="132347"/>
+              <w:color w:val="0E324D"/>
               <w:sz w:val="15"/>
             </w:rPr>
             <w:t>Smart Investment (Sierra Leone)</w:t>
@@ -1735,7 +1735,7 @@
           </w:pPr>
           <w:r>
             <w:rPr>
-              <w:color w:val="132347"/>
+              <w:color w:val="0E324D"/>
               <w:sz w:val="15"/>
             </w:rPr>
             <w:t>in partnership with Smart Impact Consult</w:t>
@@ -1763,7 +1763,7 @@
           </w:pPr>
           <w:r>
             <w:rPr>
-              <w:color w:val="132347"/>
+              <w:color w:val="0E324D"/>
               <w:sz w:val="15"/>
             </w:rPr>
             <w:t>Freetown, Sierra Leone</w:t>
@@ -1775,7 +1775,7 @@
           </w:pPr>
           <w:r>
             <w:rPr>
-              <w:color w:val="132347"/>
+              <w:color w:val="0E324D"/>
               <w:sz w:val="15"/>
             </w:rPr>
             <w:t>[address TBC]</w:t>
@@ -1803,7 +1803,7 @@
           </w:pPr>
           <w:r>
             <w:rPr>
-              <w:color w:val="132347"/>
+              <w:color w:val="0E324D"/>
               <w:sz w:val="15"/>
             </w:rPr>
             <w:t>Email: regina@smartimpactconsult.com</w:t>
@@ -1815,7 +1815,7 @@
           </w:pPr>
           <w:r>
             <w:rPr>
-              <w:color w:val="132347"/>
+              <w:color w:val="0E324D"/>
               <w:sz w:val="15"/>
             </w:rPr>
             <w:t>smartimpactconsult.com</w:t>

</xml_diff>